<commit_message>
docs: fix stale companion-file references inside the Math Overview docs
The two Math Overview .docx files still referenced the old 'Big_Bad_Wolf_Saloon_'
prefixed companion filenames (e.g. the Math Model .xlsx and the overview itself).
Strip the prefix in word/document.xml so the in-document references match the
renamed files, and re-export both PDFs.

Co-Authored-By: Claude Opus 4.8 <noreply@anthropic.com>
</commit_message>
<xml_diff>
--- a/docs/Math_Overview_85%_RTP.docx
+++ b/docs/Math_Overview_85%_RTP.docx
@@ -529,7 +529,7 @@
                 <w:sz w:val="20"/>
                 <w:szCs w:val="20"/>
               </w:rPr>
-              <w:t xml:space="preserve">Big_Bad_Wolf_Saloon_Math_Model_85%_RTP.xlsx</w:t>
+              <w:t xml:space="preserve">Math_Model_85%_RTP.xlsx</w:t>
             </w:r>
           </w:p>
         </w:tc>
@@ -3531,7 +3531,7 @@
                 <w:sz w:val="20"/>
                 <w:szCs w:val="20"/>
               </w:rPr>
-              <w:t xml:space="preserve">Big_Bad_Wolf_Saloon_Math_Model_85%_RTP.xlsx</w:t>
+              <w:t xml:space="preserve">Math_Model_85%_RTP.xlsx</w:t>
             </w:r>
           </w:p>
         </w:tc>
@@ -3600,7 +3600,7 @@
                 <w:sz w:val="20"/>
                 <w:szCs w:val="20"/>
               </w:rPr>
-              <w:t xml:space="preserve">Big_Bad_Wolf_Saloon_Math_Overview_85%_RTP.docx</w:t>
+              <w:t xml:space="preserve">Math_Overview_85%_RTP.docx</w:t>
             </w:r>
           </w:p>
         </w:tc>

</xml_diff>